<commit_message>
feat: implement project manager assignment, auto role elevation, unique project names, and simplified request types (LC-99 to LC-101)
</commit_message>
<xml_diff>
--- a/docs/05_LOGIC_CONFLICTS_AND_BUSINESS_RULES_LOG.docx
+++ b/docs/05_LOGIC_CONFLICTS_AND_BUSINESS_RULES_LOG.docx
@@ -26832,6 +26832,920 @@
           <w:shd w:fill="F1F5F9"/>
         </w:rPr>
         <w:t xml:space="preserve">fe/src/components/kanban/TaskDetailModal.tsx</w:t>
+      </w:r>
+      <w:r>
+        <w:rPr>
+          <w:rFonts w:ascii="Calibri" w:cs="Calibri" w:eastAsia="Calibri" w:hAnsi="Calibri"/>
+        </w:rPr>
+        <w:t xml:space="preserve">.</w:t>
+      </w:r>
+    </w:p>
+    <w:p>
+      <w:pPr>
+        <w:pStyle w:val="ListParagraph"/>
+        <w:numPr>
+          <w:ilvl w:val="0"/>
+          <w:numId w:val="1"/>
+        </w:numPr>
+        <w:spacing w:after="40" w:before="40"/>
+      </w:pPr>
+      <w:r>
+        <w:rPr>
+          <w:rFonts w:ascii="Calibri" w:cs="Calibri" w:eastAsia="Calibri" w:hAnsi="Calibri"/>
+          <w:b/>
+          <w:bCs/>
+        </w:rPr>
+        <w:t xml:space="preserve">Trạng thái:</w:t>
+      </w:r>
+      <w:r>
+        <w:rPr>
+          <w:rFonts w:ascii="Calibri" w:cs="Calibri" w:eastAsia="Calibri" w:hAnsi="Calibri"/>
+        </w:rPr>
+        <w:t xml:space="preserve"> ✅ </w:t>
+      </w:r>
+      <w:r>
+        <w:rPr>
+          <w:rFonts w:ascii="Calibri" w:cs="Calibri" w:eastAsia="Calibri" w:hAnsi="Calibri"/>
+          <w:b/>
+          <w:bCs/>
+        </w:rPr>
+        <w:t xml:space="preserve">Đã hoàn thành &amp; Kiểm thử 100% (Build Pass Exit Code 0)</w:t>
+      </w:r>
+      <w:r>
+        <w:rPr>
+          <w:rFonts w:ascii="Calibri" w:cs="Calibri" w:eastAsia="Calibri" w:hAnsi="Calibri"/>
+        </w:rPr>
+        <w:t xml:space="preserve">.</w:t>
+      </w:r>
+    </w:p>
+    <w:p>
+      <w:pPr>
+        <w:pBdr>
+          <w:bottom w:color="CBD5E1" w:sz="6" w:space="1"/>
+        </w:pBdr>
+        <w:spacing w:after="120" w:before="120"/>
+      </w:pPr>
+    </w:p>
+    <w:p>
+      <w:pPr>
+        <w:pStyle w:val="Heading3"/>
+        <w:spacing w:after="120" w:before="240"/>
+      </w:pPr>
+      <w:r>
+        <w:rPr>
+          <w:rFonts w:ascii="Calibri" w:cs="Calibri" w:eastAsia="Calibri" w:hAnsi="Calibri"/>
+          <w:b/>
+          <w:bCs/>
+          <w:color w:val="334155"/>
+          <w:sz w:val="24"/>
+          <w:szCs w:val="24"/>
+        </w:rPr>
+        <w:t xml:space="preserve">[LC-100] Chặn Tuyệt Đối Trùng Tên Dự Án Toàn Diện &amp; Chuẩn Hóa Loại Yêu Cầu (Universal Unique Project Name Enforcement &amp; Simplified Request Types)</w:t>
+      </w:r>
+    </w:p>
+    <w:p>
+      <w:pPr>
+        <w:pStyle w:val="ListParagraph"/>
+        <w:numPr>
+          <w:ilvl w:val="0"/>
+          <w:numId w:val="1"/>
+        </w:numPr>
+        <w:spacing w:after="40" w:before="40"/>
+      </w:pPr>
+      <w:r>
+        <w:rPr>
+          <w:rFonts w:ascii="Calibri" w:cs="Calibri" w:eastAsia="Calibri" w:hAnsi="Calibri"/>
+          <w:b/>
+          <w:bCs/>
+        </w:rPr>
+        <w:t xml:space="preserve">Mức độ:</w:t>
+      </w:r>
+      <w:r>
+        <w:rPr>
+          <w:rFonts w:ascii="Calibri" w:cs="Calibri" w:eastAsia="Calibri" w:hAnsi="Calibri"/>
+        </w:rPr>
+        <w:t xml:space="preserve"> 🔴 </w:t>
+      </w:r>
+      <w:r>
+        <w:rPr>
+          <w:rFonts w:ascii="Calibri" w:cs="Calibri" w:eastAsia="Calibri" w:hAnsi="Calibri"/>
+          <w:b/>
+          <w:bCs/>
+        </w:rPr>
+        <w:t xml:space="preserve">CRITICAL</w:t>
+      </w:r>
+    </w:p>
+    <w:p>
+      <w:pPr>
+        <w:pStyle w:val="ListParagraph"/>
+        <w:numPr>
+          <w:ilvl w:val="0"/>
+          <w:numId w:val="1"/>
+        </w:numPr>
+        <w:spacing w:after="40" w:before="40"/>
+      </w:pPr>
+      <w:r>
+        <w:rPr>
+          <w:rFonts w:ascii="Calibri" w:cs="Calibri" w:eastAsia="Calibri" w:hAnsi="Calibri"/>
+          <w:b/>
+          <w:bCs/>
+        </w:rPr>
+        <w:t xml:space="preserve">Vấn đề (Root Cause):</w:t>
+      </w:r>
+      <w:r>
+        <w:rPr>
+          <w:rFonts w:ascii="Calibri" w:cs="Calibri" w:eastAsia="Calibri" w:hAnsi="Calibri"/>
+        </w:rPr>
+        <w:t xml:space="preserve">
+1. Hệ thống trước đây cho phép tạo hoặc đổi tên nhiều Dự án trùng khớp nhau do chỉ kiểm tra phân biệt chữ hoa/thường (</w:t>
+      </w:r>
+      <w:r>
+        <w:rPr>
+          <w:rFonts w:ascii="Consolas" w:cs="Consolas" w:eastAsia="Consolas" w:hAnsi="Consolas"/>
+          <w:sz w:val="20"/>
+          <w:szCs w:val="20"/>
+          <w:shd w:fill="F1F5F9"/>
+        </w:rPr>
+        <w:t xml:space="preserve">equals</w:t>
+      </w:r>
+      <w:r>
+        <w:rPr>
+          <w:rFonts w:ascii="Calibri" w:cs="Calibri" w:eastAsia="Calibri" w:hAnsi="Calibri"/>
+        </w:rPr>
+        <w:t xml:space="preserve">) và không xét các dự án đang hoạt động (</w:t>
+      </w:r>
+      <w:r>
+        <w:rPr>
+          <w:rFonts w:ascii="Consolas" w:cs="Consolas" w:eastAsia="Consolas" w:hAnsi="Consolas"/>
+          <w:sz w:val="20"/>
+          <w:szCs w:val="20"/>
+          <w:shd w:fill="F1F5F9"/>
+        </w:rPr>
+        <w:t xml:space="preserve">isDeleted: false</w:t>
+      </w:r>
+      <w:r>
+        <w:rPr>
+          <w:rFonts w:ascii="Calibri" w:cs="Calibri" w:eastAsia="Calibri" w:hAnsi="Calibri"/>
+        </w:rPr>
+        <w:t xml:space="preserve">). Điều này gây nhầm lẫn nghiêm trọng khi phân loại công việc, lọc lịch trình, và gửi thông báo.
+2. Tại hộp thoại chuyển giao </w:t>
+      </w:r>
+      <w:r>
+        <w:rPr>
+          <w:rFonts w:ascii="Consolas" w:cs="Consolas" w:eastAsia="Consolas" w:hAnsi="Consolas"/>
+          <w:sz w:val="20"/>
+          <w:szCs w:val="20"/>
+          <w:shd w:fill="F1F5F9"/>
+        </w:rPr>
+        <w:t xml:space="preserve">TaskRequestModal</w:t>
+      </w:r>
+      <w:r>
+        <w:rPr>
+          <w:rFonts w:ascii="Calibri" w:cs="Calibri" w:eastAsia="Calibri" w:hAnsi="Calibri"/>
+        </w:rPr>
+        <w:t xml:space="preserve">, tùy chọn "Chờ Duyệt" (</w:t>
+      </w:r>
+      <w:r>
+        <w:rPr>
+          <w:rFonts w:ascii="Consolas" w:cs="Consolas" w:eastAsia="Consolas" w:hAnsi="Consolas"/>
+          <w:sz w:val="20"/>
+          <w:szCs w:val="20"/>
+          <w:shd w:fill="F1F5F9"/>
+        </w:rPr>
+        <w:t xml:space="preserve">REVIEW</w:t>
+      </w:r>
+      <w:r>
+        <w:rPr>
+          <w:rFonts w:ascii="Calibri" w:cs="Calibri" w:eastAsia="Calibri" w:hAnsi="Calibri"/>
+        </w:rPr>
+        <w:t xml:space="preserve">) gây nhầm lẫn với quy trình duyệt trực tiếp của Quản lý trên từng Subtask.</w:t>
+      </w:r>
+    </w:p>
+    <w:p>
+      <w:pPr>
+        <w:pStyle w:val="ListParagraph"/>
+        <w:numPr>
+          <w:ilvl w:val="0"/>
+          <w:numId w:val="1"/>
+        </w:numPr>
+        <w:spacing w:after="40" w:before="40"/>
+      </w:pPr>
+      <w:r>
+        <w:rPr>
+          <w:rFonts w:ascii="Calibri" w:cs="Calibri" w:eastAsia="Calibri" w:hAnsi="Calibri"/>
+          <w:b/>
+          <w:bCs/>
+        </w:rPr>
+        <w:t xml:space="preserve">Giải pháp kỹ thuật:</w:t>
+      </w:r>
+      <w:r>
+        <w:rPr>
+          <w:rFonts w:ascii="Calibri" w:cs="Calibri" w:eastAsia="Calibri" w:hAnsi="Calibri"/>
+        </w:rPr>
+        <w:t xml:space="preserve">
+1. </w:t>
+      </w:r>
+      <w:r>
+        <w:rPr>
+          <w:rFonts w:ascii="Calibri" w:cs="Calibri" w:eastAsia="Calibri" w:hAnsi="Calibri"/>
+          <w:b/>
+          <w:bCs/>
+        </w:rPr>
+        <w:t xml:space="preserve">Chặn trùng tên dự án không phân biệt hoa thường (`mode: 'insensitive'`)</w:t>
+      </w:r>
+      <w:r>
+        <w:rPr>
+          <w:rFonts w:ascii="Calibri" w:cs="Calibri" w:eastAsia="Calibri" w:hAnsi="Calibri"/>
+        </w:rPr>
+        <w:t xml:space="preserve">:
+   - Trong </w:t>
+      </w:r>
+      <w:r>
+        <w:rPr>
+          <w:rFonts w:ascii="Consolas" w:cs="Consolas" w:eastAsia="Consolas" w:hAnsi="Consolas"/>
+          <w:sz w:val="20"/>
+          <w:szCs w:val="20"/>
+          <w:shd w:fill="F1F5F9"/>
+        </w:rPr>
+        <w:t xml:space="preserve">ProjectService.create</w:t>
+      </w:r>
+      <w:r>
+        <w:rPr>
+          <w:rFonts w:ascii="Calibri" w:cs="Calibri" w:eastAsia="Calibri" w:hAnsi="Calibri"/>
+        </w:rPr>
+        <w:t xml:space="preserve">: Quét </w:t>
+      </w:r>
+      <w:r>
+        <w:rPr>
+          <w:rFonts w:ascii="Consolas" w:cs="Consolas" w:eastAsia="Consolas" w:hAnsi="Consolas"/>
+          <w:sz w:val="20"/>
+          <w:szCs w:val="20"/>
+          <w:shd w:fill="F1F5F9"/>
+        </w:rPr>
+        <w:t xml:space="preserve">this.prisma.project.findFirst({ where: { isDeleted: false, name: { equals: trimmedName, mode: 'insensitive' } } })</w:t>
+      </w:r>
+      <w:r>
+        <w:rPr>
+          <w:rFonts w:ascii="Calibri" w:cs="Calibri" w:eastAsia="Calibri" w:hAnsi="Calibri"/>
+        </w:rPr>
+        <w:t xml:space="preserve">. Nếu trùng, trả về lỗi </w:t>
+      </w:r>
+      <w:r>
+        <w:rPr>
+          <w:rFonts w:ascii="Consolas" w:cs="Consolas" w:eastAsia="Consolas" w:hAnsi="Consolas"/>
+          <w:sz w:val="20"/>
+          <w:szCs w:val="20"/>
+          <w:shd w:fill="F1F5F9"/>
+        </w:rPr>
+        <w:t xml:space="preserve">400 Bad Request</w:t>
+      </w:r>
+      <w:r>
+        <w:rPr>
+          <w:rFonts w:ascii="Calibri" w:cs="Calibri" w:eastAsia="Calibri" w:hAnsi="Calibri"/>
+        </w:rPr>
+        <w:t xml:space="preserve">.
+   - Trong </w:t>
+      </w:r>
+      <w:r>
+        <w:rPr>
+          <w:rFonts w:ascii="Consolas" w:cs="Consolas" w:eastAsia="Consolas" w:hAnsi="Consolas"/>
+          <w:sz w:val="20"/>
+          <w:szCs w:val="20"/>
+          <w:shd w:fill="F1F5F9"/>
+        </w:rPr>
+        <w:t xml:space="preserve">ProjectService.update</w:t>
+      </w:r>
+      <w:r>
+        <w:rPr>
+          <w:rFonts w:ascii="Calibri" w:cs="Calibri" w:eastAsia="Calibri" w:hAnsi="Calibri"/>
+        </w:rPr>
+        <w:t xml:space="preserve">: Khi đổi tên dự án, kiểm tra trùng tên với tất cả các dự án khác (</w:t>
+      </w:r>
+      <w:r>
+        <w:rPr>
+          <w:rFonts w:ascii="Consolas" w:cs="Consolas" w:eastAsia="Consolas" w:hAnsi="Consolas"/>
+          <w:sz w:val="20"/>
+          <w:szCs w:val="20"/>
+          <w:shd w:fill="F1F5F9"/>
+        </w:rPr>
+        <w:t xml:space="preserve">id: { not: id }</w:t>
+      </w:r>
+      <w:r>
+        <w:rPr>
+          <w:rFonts w:ascii="Calibri" w:cs="Calibri" w:eastAsia="Calibri" w:hAnsi="Calibri"/>
+        </w:rPr>
+        <w:t xml:space="preserve">).
+   - Trong </w:t>
+      </w:r>
+      <w:r>
+        <w:rPr>
+          <w:rFonts w:ascii="Consolas" w:cs="Consolas" w:eastAsia="Consolas" w:hAnsi="Consolas"/>
+          <w:sz w:val="20"/>
+          <w:szCs w:val="20"/>
+          <w:shd w:fill="F1F5F9"/>
+        </w:rPr>
+        <w:t xml:space="preserve">ProjectService.restore</w:t>
+      </w:r>
+      <w:r>
+        <w:rPr>
+          <w:rFonts w:ascii="Calibri" w:cs="Calibri" w:eastAsia="Calibri" w:hAnsi="Calibri"/>
+        </w:rPr>
+        <w:t xml:space="preserve">: Nếu dự án trong thùng rác có tên trùng với một dự án mới tạo sau đó, hệ thống tự động đổi tên hậu tố </w:t>
+      </w:r>
+      <w:r>
+        <w:rPr>
+          <w:rFonts w:ascii="Consolas" w:cs="Consolas" w:eastAsia="Consolas" w:hAnsi="Consolas"/>
+          <w:sz w:val="20"/>
+          <w:szCs w:val="20"/>
+          <w:shd w:fill="F1F5F9"/>
+        </w:rPr>
+        <w:t xml:space="preserve">(Khôi phục DD/MM/YYYY)</w:t>
+      </w:r>
+      <w:r>
+        <w:rPr>
+          <w:rFonts w:ascii="Calibri" w:cs="Calibri" w:eastAsia="Calibri" w:hAnsi="Calibri"/>
+        </w:rPr>
+        <w:t xml:space="preserve"> để tránh va chạm.
+   - Phía Client </w:t>
+      </w:r>
+      <w:r>
+        <w:rPr>
+          <w:rFonts w:ascii="Consolas" w:cs="Consolas" w:eastAsia="Consolas" w:hAnsi="Consolas"/>
+          <w:sz w:val="20"/>
+          <w:szCs w:val="20"/>
+          <w:shd w:fill="F1F5F9"/>
+        </w:rPr>
+        <w:t xml:space="preserve">CreateProjectModal</w:t>
+      </w:r>
+      <w:r>
+        <w:rPr>
+          <w:rFonts w:ascii="Calibri" w:cs="Calibri" w:eastAsia="Calibri" w:hAnsi="Calibri"/>
+        </w:rPr>
+        <w:t xml:space="preserve">: Thực hiện kiểm tra trùng tên tức thì trước khi gửi request.
+2. </w:t>
+      </w:r>
+      <w:r>
+        <w:rPr>
+          <w:rFonts w:ascii="Calibri" w:cs="Calibri" w:eastAsia="Calibri" w:hAnsi="Calibri"/>
+          <w:b/>
+          <w:bCs/>
+        </w:rPr>
+        <w:t xml:space="preserve">Tinh gọn loại yêu cầu</w:t>
+      </w:r>
+      <w:r>
+        <w:rPr>
+          <w:rFonts w:ascii="Calibri" w:cs="Calibri" w:eastAsia="Calibri" w:hAnsi="Calibri"/>
+        </w:rPr>
+        <w:t xml:space="preserve">: Loại bỏ tùy chọn "Chờ Duyệt" khỏi </w:t>
+      </w:r>
+      <w:r>
+        <w:rPr>
+          <w:rFonts w:ascii="Consolas" w:cs="Consolas" w:eastAsia="Consolas" w:hAnsi="Consolas"/>
+          <w:sz w:val="20"/>
+          <w:szCs w:val="20"/>
+          <w:shd w:fill="F1F5F9"/>
+        </w:rPr>
+        <w:t xml:space="preserve">TaskRequestModal</w:t>
+      </w:r>
+      <w:r>
+        <w:rPr>
+          <w:rFonts w:ascii="Calibri" w:cs="Calibri" w:eastAsia="Calibri" w:hAnsi="Calibri"/>
+        </w:rPr>
+        <w:t xml:space="preserve">, chỉ giữ lại 2 nghiệp vụ rõ ràng: </w:t>
+      </w:r>
+      <w:r>
+        <w:rPr>
+          <w:rFonts w:ascii="Calibri" w:cs="Calibri" w:eastAsia="Calibri" w:hAnsi="Calibri"/>
+          <w:b/>
+          <w:bCs/>
+        </w:rPr>
+        <w:t xml:space="preserve">`🔄 Chuyển Giao (TRANSFER)`</w:t>
+      </w:r>
+      <w:r>
+        <w:rPr>
+          <w:rFonts w:ascii="Calibri" w:cs="Calibri" w:eastAsia="Calibri" w:hAnsi="Calibri"/>
+        </w:rPr>
+        <w:t xml:space="preserve"> và </w:t>
+      </w:r>
+      <w:r>
+        <w:rPr>
+          <w:rFonts w:ascii="Calibri" w:cs="Calibri" w:eastAsia="Calibri" w:hAnsi="Calibri"/>
+          <w:b/>
+          <w:bCs/>
+        </w:rPr>
+        <w:t xml:space="preserve">`🤝 Cần Hỗ Trợ (ASSIST)`</w:t>
+      </w:r>
+      <w:r>
+        <w:rPr>
+          <w:rFonts w:ascii="Calibri" w:cs="Calibri" w:eastAsia="Calibri" w:hAnsi="Calibri"/>
+        </w:rPr>
+        <w:t xml:space="preserve">.</w:t>
+      </w:r>
+    </w:p>
+    <w:p>
+      <w:pPr>
+        <w:pStyle w:val="ListParagraph"/>
+        <w:numPr>
+          <w:ilvl w:val="0"/>
+          <w:numId w:val="1"/>
+        </w:numPr>
+        <w:spacing w:after="40" w:before="40"/>
+      </w:pPr>
+      <w:r>
+        <w:rPr>
+          <w:rFonts w:ascii="Calibri" w:cs="Calibri" w:eastAsia="Calibri" w:hAnsi="Calibri"/>
+          <w:b/>
+          <w:bCs/>
+        </w:rPr>
+        <w:t xml:space="preserve">File ảnh hưởng:</w:t>
+      </w:r>
+      <w:r>
+        <w:rPr>
+          <w:rFonts w:ascii="Calibri" w:cs="Calibri" w:eastAsia="Calibri" w:hAnsi="Calibri"/>
+        </w:rPr>
+        <w:t xml:space="preserve"> </w:t>
+      </w:r>
+      <w:r>
+        <w:rPr>
+          <w:rFonts w:ascii="Consolas" w:cs="Consolas" w:eastAsia="Consolas" w:hAnsi="Consolas"/>
+          <w:sz w:val="20"/>
+          <w:szCs w:val="20"/>
+          <w:shd w:fill="F1F5F9"/>
+        </w:rPr>
+        <w:t xml:space="preserve">be/src/modules/project/project.service.ts</w:t>
+      </w:r>
+      <w:r>
+        <w:rPr>
+          <w:rFonts w:ascii="Calibri" w:cs="Calibri" w:eastAsia="Calibri" w:hAnsi="Calibri"/>
+        </w:rPr>
+        <w:t xml:space="preserve">, </w:t>
+      </w:r>
+      <w:r>
+        <w:rPr>
+          <w:rFonts w:ascii="Consolas" w:cs="Consolas" w:eastAsia="Consolas" w:hAnsi="Consolas"/>
+          <w:sz w:val="20"/>
+          <w:szCs w:val="20"/>
+          <w:shd w:fill="F1F5F9"/>
+        </w:rPr>
+        <w:t xml:space="preserve">fe/src/components/kanban/CreateProjectModal.tsx</w:t>
+      </w:r>
+      <w:r>
+        <w:rPr>
+          <w:rFonts w:ascii="Calibri" w:cs="Calibri" w:eastAsia="Calibri" w:hAnsi="Calibri"/>
+        </w:rPr>
+        <w:t xml:space="preserve">, </w:t>
+      </w:r>
+      <w:r>
+        <w:rPr>
+          <w:rFonts w:ascii="Consolas" w:cs="Consolas" w:eastAsia="Consolas" w:hAnsi="Consolas"/>
+          <w:sz w:val="20"/>
+          <w:szCs w:val="20"/>
+          <w:shd w:fill="F1F5F9"/>
+        </w:rPr>
+        <w:t xml:space="preserve">fe/src/components/kanban/TaskRequestModal.tsx</w:t>
+      </w:r>
+      <w:r>
+        <w:rPr>
+          <w:rFonts w:ascii="Calibri" w:cs="Calibri" w:eastAsia="Calibri" w:hAnsi="Calibri"/>
+        </w:rPr>
+        <w:t xml:space="preserve">, </w:t>
+      </w:r>
+      <w:r>
+        <w:rPr>
+          <w:rFonts w:ascii="Consolas" w:cs="Consolas" w:eastAsia="Consolas" w:hAnsi="Consolas"/>
+          <w:sz w:val="20"/>
+          <w:szCs w:val="20"/>
+          <w:shd w:fill="F1F5F9"/>
+        </w:rPr>
+        <w:t xml:space="preserve">fe/src/pages/BoardPage.tsx</w:t>
+      </w:r>
+      <w:r>
+        <w:rPr>
+          <w:rFonts w:ascii="Calibri" w:cs="Calibri" w:eastAsia="Calibri" w:hAnsi="Calibri"/>
+        </w:rPr>
+        <w:t xml:space="preserve">.</w:t>
+      </w:r>
+    </w:p>
+    <w:p>
+      <w:pPr>
+        <w:pStyle w:val="ListParagraph"/>
+        <w:numPr>
+          <w:ilvl w:val="0"/>
+          <w:numId w:val="1"/>
+        </w:numPr>
+        <w:spacing w:after="40" w:before="40"/>
+      </w:pPr>
+      <w:r>
+        <w:rPr>
+          <w:rFonts w:ascii="Calibri" w:cs="Calibri" w:eastAsia="Calibri" w:hAnsi="Calibri"/>
+          <w:b/>
+          <w:bCs/>
+        </w:rPr>
+        <w:t xml:space="preserve">Trạng thái:</w:t>
+      </w:r>
+      <w:r>
+        <w:rPr>
+          <w:rFonts w:ascii="Calibri" w:cs="Calibri" w:eastAsia="Calibri" w:hAnsi="Calibri"/>
+        </w:rPr>
+        <w:t xml:space="preserve"> ✅ </w:t>
+      </w:r>
+      <w:r>
+        <w:rPr>
+          <w:rFonts w:ascii="Calibri" w:cs="Calibri" w:eastAsia="Calibri" w:hAnsi="Calibri"/>
+          <w:b/>
+          <w:bCs/>
+        </w:rPr>
+        <w:t xml:space="preserve">Đã hoàn thành &amp; Kiểm thử 100% (Build Pass Exit Code 0)</w:t>
+      </w:r>
+      <w:r>
+        <w:rPr>
+          <w:rFonts w:ascii="Calibri" w:cs="Calibri" w:eastAsia="Calibri" w:hAnsi="Calibri"/>
+        </w:rPr>
+        <w:t xml:space="preserve">.</w:t>
+      </w:r>
+    </w:p>
+    <w:p>
+      <w:pPr>
+        <w:pBdr>
+          <w:bottom w:color="CBD5E1" w:sz="6" w:space="1"/>
+        </w:pBdr>
+        <w:spacing w:after="120" w:before="120"/>
+      </w:pPr>
+    </w:p>
+    <w:p>
+      <w:pPr>
+        <w:pStyle w:val="Heading3"/>
+        <w:spacing w:after="120" w:before="240"/>
+      </w:pPr>
+      <w:r>
+        <w:rPr>
+          <w:rFonts w:ascii="Calibri" w:cs="Calibri" w:eastAsia="Calibri" w:hAnsi="Calibri"/>
+          <w:b/>
+          <w:bCs/>
+          <w:color w:val="334155"/>
+          <w:sz w:val="24"/>
+          <w:szCs w:val="24"/>
+        </w:rPr>
+        <w:t xml:space="preserve">[LC-101] Chỉ Định Quản Lý Dự Án &amp; Tự Động Cấp Quyền Manager Cho Nhân Viên (Project Manager Assignment &amp; Automatic Role Elevation)</w:t>
+      </w:r>
+    </w:p>
+    <w:p>
+      <w:pPr>
+        <w:pStyle w:val="ListParagraph"/>
+        <w:numPr>
+          <w:ilvl w:val="0"/>
+          <w:numId w:val="1"/>
+        </w:numPr>
+        <w:spacing w:after="40" w:before="40"/>
+      </w:pPr>
+      <w:r>
+        <w:rPr>
+          <w:rFonts w:ascii="Calibri" w:cs="Calibri" w:eastAsia="Calibri" w:hAnsi="Calibri"/>
+          <w:b/>
+          <w:bCs/>
+        </w:rPr>
+        <w:t xml:space="preserve">Mức độ:</w:t>
+      </w:r>
+      <w:r>
+        <w:rPr>
+          <w:rFonts w:ascii="Calibri" w:cs="Calibri" w:eastAsia="Calibri" w:hAnsi="Calibri"/>
+        </w:rPr>
+        <w:t xml:space="preserve"> 🔴 </w:t>
+      </w:r>
+      <w:r>
+        <w:rPr>
+          <w:rFonts w:ascii="Calibri" w:cs="Calibri" w:eastAsia="Calibri" w:hAnsi="Calibri"/>
+          <w:b/>
+          <w:bCs/>
+        </w:rPr>
+        <w:t xml:space="preserve">CRITICAL</w:t>
+      </w:r>
+    </w:p>
+    <w:p>
+      <w:pPr>
+        <w:pStyle w:val="ListParagraph"/>
+        <w:numPr>
+          <w:ilvl w:val="0"/>
+          <w:numId w:val="1"/>
+        </w:numPr>
+        <w:spacing w:after="40" w:before="40"/>
+      </w:pPr>
+      <w:r>
+        <w:rPr>
+          <w:rFonts w:ascii="Calibri" w:cs="Calibri" w:eastAsia="Calibri" w:hAnsi="Calibri"/>
+          <w:b/>
+          <w:bCs/>
+        </w:rPr>
+        <w:t xml:space="preserve">Vấn đề (Root Cause):</w:t>
+      </w:r>
+      <w:r>
+        <w:rPr>
+          <w:rFonts w:ascii="Calibri" w:cs="Calibri" w:eastAsia="Calibri" w:hAnsi="Calibri"/>
+        </w:rPr>
+        <w:t xml:space="preserve">
+1. Trong biểu mẫu khởi tạo dự án (</w:t>
+      </w:r>
+      <w:r>
+        <w:rPr>
+          <w:rFonts w:ascii="Consolas" w:cs="Consolas" w:eastAsia="Consolas" w:hAnsi="Consolas"/>
+          <w:sz w:val="20"/>
+          <w:szCs w:val="20"/>
+          <w:shd w:fill="F1F5F9"/>
+        </w:rPr>
+        <w:t xml:space="preserve">CreateProjectModal</w:t>
+      </w:r>
+      <w:r>
+        <w:rPr>
+          <w:rFonts w:ascii="Calibri" w:cs="Calibri" w:eastAsia="Calibri" w:hAnsi="Calibri"/>
+        </w:rPr>
+        <w:t xml:space="preserve">), trước đây thiếu trường chọn Quản lý dự án (</w:t>
+      </w:r>
+      <w:r>
+        <w:rPr>
+          <w:rFonts w:ascii="Consolas" w:cs="Consolas" w:eastAsia="Consolas" w:hAnsi="Consolas"/>
+          <w:sz w:val="20"/>
+          <w:szCs w:val="20"/>
+          <w:shd w:fill="F1F5F9"/>
+        </w:rPr>
+        <w:t xml:space="preserve">selectedManagerId</w:t>
+      </w:r>
+      <w:r>
+        <w:rPr>
+          <w:rFonts w:ascii="Calibri" w:cs="Calibri" w:eastAsia="Calibri" w:hAnsi="Calibri"/>
+        </w:rPr>
+        <w:t xml:space="preserve">), khiến mọi dự án mới tạo đều mặc định rơi vào Admin và không thể phân quyền linh hoạt cho các Manager khác hoặc nhân viên chủ chốt.
+2. Khi chỉ định một Nhân viên (</w:t>
+      </w:r>
+      <w:r>
+        <w:rPr>
+          <w:rFonts w:ascii="Consolas" w:cs="Consolas" w:eastAsia="Consolas" w:hAnsi="Consolas"/>
+          <w:sz w:val="20"/>
+          <w:szCs w:val="20"/>
+          <w:shd w:fill="F1F5F9"/>
+        </w:rPr>
+        <w:t xml:space="preserve">role: EMPLOYEE</w:t>
+      </w:r>
+      <w:r>
+        <w:rPr>
+          <w:rFonts w:ascii="Calibri" w:cs="Calibri" w:eastAsia="Calibri" w:hAnsi="Calibri"/>
+        </w:rPr>
+        <w:t xml:space="preserve">) làm Quản lý dự án mới, nếu không nâng cấp quyền hạn của họ trong hệ thống thì họ sẽ bị thiếu các đặc quyền quan trọng (phê duyệt việc con, chuyển giao task, cấu hình pipeline).</w:t>
+      </w:r>
+    </w:p>
+    <w:p>
+      <w:pPr>
+        <w:pStyle w:val="ListParagraph"/>
+        <w:numPr>
+          <w:ilvl w:val="0"/>
+          <w:numId w:val="1"/>
+        </w:numPr>
+        <w:spacing w:after="40" w:before="40"/>
+      </w:pPr>
+      <w:r>
+        <w:rPr>
+          <w:rFonts w:ascii="Calibri" w:cs="Calibri" w:eastAsia="Calibri" w:hAnsi="Calibri"/>
+          <w:b/>
+          <w:bCs/>
+        </w:rPr>
+        <w:t xml:space="preserve">Giải pháp kỹ thuật:</w:t>
+      </w:r>
+      <w:r>
+        <w:rPr>
+          <w:rFonts w:ascii="Calibri" w:cs="Calibri" w:eastAsia="Calibri" w:hAnsi="Calibri"/>
+        </w:rPr>
+        <w:t xml:space="preserve">
+1. </w:t>
+      </w:r>
+      <w:r>
+        <w:rPr>
+          <w:rFonts w:ascii="Calibri" w:cs="Calibri" w:eastAsia="Calibri" w:hAnsi="Calibri"/>
+          <w:b/>
+          <w:bCs/>
+        </w:rPr>
+        <w:t xml:space="preserve">Thêm mục Chọn Quản Lý Dự Án trong `CreateProjectModal`</w:t>
+      </w:r>
+      <w:r>
+        <w:rPr>
+          <w:rFonts w:ascii="Calibri" w:cs="Calibri" w:eastAsia="Calibri" w:hAnsi="Calibri"/>
+        </w:rPr>
+        <w:t xml:space="preserve">:
+   - Cho phép Admin chọn: Chính mình (</w:t>
+      </w:r>
+      <w:r>
+        <w:rPr>
+          <w:rFonts w:ascii="Consolas" w:cs="Consolas" w:eastAsia="Consolas" w:hAnsi="Consolas"/>
+          <w:sz w:val="20"/>
+          <w:szCs w:val="20"/>
+          <w:shd w:fill="F1F5F9"/>
+        </w:rPr>
+        <w:t xml:space="preserve">Admin</w:t>
+      </w:r>
+      <w:r>
+        <w:rPr>
+          <w:rFonts w:ascii="Calibri" w:cs="Calibri" w:eastAsia="Calibri" w:hAnsi="Calibri"/>
+        </w:rPr>
+        <w:t xml:space="preserve">), các User đã có vai trò </w:t>
+      </w:r>
+      <w:r>
+        <w:rPr>
+          <w:rFonts w:ascii="Consolas" w:cs="Consolas" w:eastAsia="Consolas" w:hAnsi="Consolas"/>
+          <w:sz w:val="20"/>
+          <w:szCs w:val="20"/>
+          <w:shd w:fill="F1F5F9"/>
+        </w:rPr>
+        <w:t xml:space="preserve">MANAGER</w:t>
+      </w:r>
+      <w:r>
+        <w:rPr>
+          <w:rFonts w:ascii="Calibri" w:cs="Calibri" w:eastAsia="Calibri" w:hAnsi="Calibri"/>
+        </w:rPr>
+        <w:t xml:space="preserve">, hoặc </w:t>
+      </w:r>
+      <w:r>
+        <w:rPr>
+          <w:rFonts w:ascii="Calibri" w:cs="Calibri" w:eastAsia="Calibri" w:hAnsi="Calibri"/>
+          <w:b/>
+          <w:bCs/>
+        </w:rPr>
+        <w:t xml:space="preserve">bất kỳ Nhân viên nào (`EMPLOYEE`)</w:t>
+      </w:r>
+      <w:r>
+        <w:rPr>
+          <w:rFonts w:ascii="Calibri" w:cs="Calibri" w:eastAsia="Calibri" w:hAnsi="Calibri"/>
+        </w:rPr>
+        <w:t xml:space="preserve"> trong tổ chức.
+   - Tự động gán Quản lý được chọn vào danh sách thành viên dự án (</w:t>
+      </w:r>
+      <w:r>
+        <w:rPr>
+          <w:rFonts w:ascii="Consolas" w:cs="Consolas" w:eastAsia="Consolas" w:hAnsi="Consolas"/>
+          <w:sz w:val="20"/>
+          <w:szCs w:val="20"/>
+          <w:shd w:fill="F1F5F9"/>
+        </w:rPr>
+        <w:t xml:space="preserve">selectedMemberIds</w:t>
+      </w:r>
+      <w:r>
+        <w:rPr>
+          <w:rFonts w:ascii="Calibri" w:cs="Calibri" w:eastAsia="Calibri" w:hAnsi="Calibri"/>
+        </w:rPr>
+        <w:t xml:space="preserve">).
+   - Hiển thị bảng mô tả đặc quyền và huy hiệu xác nhận rõ ràng.
+2. </w:t>
+      </w:r>
+      <w:r>
+        <w:rPr>
+          <w:rFonts w:ascii="Calibri" w:cs="Calibri" w:eastAsia="Calibri" w:hAnsi="Calibri"/>
+          <w:b/>
+          <w:bCs/>
+        </w:rPr>
+        <w:t xml:space="preserve">Tự động nâng cấp quyền hạn (`Role Elevation`) trong Backend</w:t>
+      </w:r>
+      <w:r>
+        <w:rPr>
+          <w:rFonts w:ascii="Calibri" w:cs="Calibri" w:eastAsia="Calibri" w:hAnsi="Calibri"/>
+        </w:rPr>
+        <w:t xml:space="preserve">:
+   - Trong </w:t>
+      </w:r>
+      <w:r>
+        <w:rPr>
+          <w:rFonts w:ascii="Consolas" w:cs="Consolas" w:eastAsia="Consolas" w:hAnsi="Consolas"/>
+          <w:sz w:val="20"/>
+          <w:szCs w:val="20"/>
+          <w:shd w:fill="F1F5F9"/>
+        </w:rPr>
+        <w:t xml:space="preserve">ProjectService.create</w:t>
+      </w:r>
+      <w:r>
+        <w:rPr>
+          <w:rFonts w:ascii="Calibri" w:cs="Calibri" w:eastAsia="Calibri" w:hAnsi="Calibri"/>
+        </w:rPr>
+        <w:t xml:space="preserve"> &amp; </w:t>
+      </w:r>
+      <w:r>
+        <w:rPr>
+          <w:rFonts w:ascii="Consolas" w:cs="Consolas" w:eastAsia="Consolas" w:hAnsi="Consolas"/>
+          <w:sz w:val="20"/>
+          <w:szCs w:val="20"/>
+          <w:shd w:fill="F1F5F9"/>
+        </w:rPr>
+        <w:t xml:space="preserve">ProjectService.update</w:t>
+      </w:r>
+      <w:r>
+        <w:rPr>
+          <w:rFonts w:ascii="Calibri" w:cs="Calibri" w:eastAsia="Calibri" w:hAnsi="Calibri"/>
+        </w:rPr>
+        <w:t xml:space="preserve">: Khi một nhân viên (</w:t>
+      </w:r>
+      <w:r>
+        <w:rPr>
+          <w:rFonts w:ascii="Consolas" w:cs="Consolas" w:eastAsia="Consolas" w:hAnsi="Consolas"/>
+          <w:sz w:val="20"/>
+          <w:szCs w:val="20"/>
+          <w:shd w:fill="F1F5F9"/>
+        </w:rPr>
+        <w:t xml:space="preserve">EMPLOYEE</w:t>
+      </w:r>
+      <w:r>
+        <w:rPr>
+          <w:rFonts w:ascii="Calibri" w:cs="Calibri" w:eastAsia="Calibri" w:hAnsi="Calibri"/>
+        </w:rPr>
+        <w:t xml:space="preserve">) được bổ nhiệm làm </w:t>
+      </w:r>
+      <w:r>
+        <w:rPr>
+          <w:rFonts w:ascii="Consolas" w:cs="Consolas" w:eastAsia="Consolas" w:hAnsi="Consolas"/>
+          <w:sz w:val="20"/>
+          <w:szCs w:val="20"/>
+          <w:shd w:fill="F1F5F9"/>
+        </w:rPr>
+        <w:t xml:space="preserve">managerId</w:t>
+      </w:r>
+      <w:r>
+        <w:rPr>
+          <w:rFonts w:ascii="Calibri" w:cs="Calibri" w:eastAsia="Calibri" w:hAnsi="Calibri"/>
+        </w:rPr>
+        <w:t xml:space="preserve"> của Dự án, Backend tự động cập nhật </w:t>
+      </w:r>
+      <w:r>
+        <w:rPr>
+          <w:rFonts w:ascii="Consolas" w:cs="Consolas" w:eastAsia="Consolas" w:hAnsi="Consolas"/>
+          <w:sz w:val="20"/>
+          <w:szCs w:val="20"/>
+          <w:shd w:fill="F1F5F9"/>
+        </w:rPr>
+        <w:t xml:space="preserve">user.role = 'MANAGER'</w:t>
+      </w:r>
+      <w:r>
+        <w:rPr>
+          <w:rFonts w:ascii="Calibri" w:cs="Calibri" w:eastAsia="Calibri" w:hAnsi="Calibri"/>
+        </w:rPr>
+        <w:t xml:space="preserve">.
+   - Người này ngay lập tức sở hữu đầy đủ quyền hạn của Quản lý: Phê duyệt/từ chối Task con (</w:t>
+      </w:r>
+      <w:r>
+        <w:rPr>
+          <w:rFonts w:ascii="Consolas" w:cs="Consolas" w:eastAsia="Consolas" w:hAnsi="Consolas"/>
+          <w:sz w:val="20"/>
+          <w:szCs w:val="20"/>
+          <w:shd w:fill="F1F5F9"/>
+        </w:rPr>
+        <w:t xml:space="preserve">Subtask Approval/Reject</w:t>
+      </w:r>
+      <w:r>
+        <w:rPr>
+          <w:rFonts w:ascii="Calibri" w:cs="Calibri" w:eastAsia="Calibri" w:hAnsi="Calibri"/>
+        </w:rPr>
+        <w:t xml:space="preserve">), điều phối tiến độ, phân công thành viên và đóng/mở giai đoạn dự án.</w:t>
+      </w:r>
+    </w:p>
+    <w:p>
+      <w:pPr>
+        <w:pStyle w:val="ListParagraph"/>
+        <w:numPr>
+          <w:ilvl w:val="0"/>
+          <w:numId w:val="1"/>
+        </w:numPr>
+        <w:spacing w:after="40" w:before="40"/>
+      </w:pPr>
+      <w:r>
+        <w:rPr>
+          <w:rFonts w:ascii="Calibri" w:cs="Calibri" w:eastAsia="Calibri" w:hAnsi="Calibri"/>
+          <w:b/>
+          <w:bCs/>
+        </w:rPr>
+        <w:t xml:space="preserve">File ảnh hưởng:</w:t>
+      </w:r>
+      <w:r>
+        <w:rPr>
+          <w:rFonts w:ascii="Calibri" w:cs="Calibri" w:eastAsia="Calibri" w:hAnsi="Calibri"/>
+        </w:rPr>
+        <w:t xml:space="preserve"> </w:t>
+      </w:r>
+      <w:r>
+        <w:rPr>
+          <w:rFonts w:ascii="Consolas" w:cs="Consolas" w:eastAsia="Consolas" w:hAnsi="Consolas"/>
+          <w:sz w:val="20"/>
+          <w:szCs w:val="20"/>
+          <w:shd w:fill="F1F5F9"/>
+        </w:rPr>
+        <w:t xml:space="preserve">fe/src/components/kanban/CreateProjectModal.tsx</w:t>
+      </w:r>
+      <w:r>
+        <w:rPr>
+          <w:rFonts w:ascii="Calibri" w:cs="Calibri" w:eastAsia="Calibri" w:hAnsi="Calibri"/>
+        </w:rPr>
+        <w:t xml:space="preserve">, </w:t>
+      </w:r>
+      <w:r>
+        <w:rPr>
+          <w:rFonts w:ascii="Consolas" w:cs="Consolas" w:eastAsia="Consolas" w:hAnsi="Consolas"/>
+          <w:sz w:val="20"/>
+          <w:szCs w:val="20"/>
+          <w:shd w:fill="F1F5F9"/>
+        </w:rPr>
+        <w:t xml:space="preserve">be/src/modules/project/project.service.ts</w:t>
       </w:r>
       <w:r>
         <w:rPr>

</xml_diff>